<commit_message>
Update SARS public officer and registered representative
</commit_message>
<xml_diff>
--- a/Governance Documents/ASCO Board Resolution 2026.docx
+++ b/Governance Documents/ASCO Board Resolution 2026.docx
@@ -174,7 +174,7 @@
           <w:color w:val="145A32"/>
           <w:sz w:val="23"/>
         </w:rPr>
-        <w:t>BOARD RESOLUTION FOR THE APPOINTMENT OF REGISTERED REPRESENTATIVES TO THE SOUTH AFRICAN REVENUE SERVICE (SARS)</w:t>
+        <w:t>BOARD RESOLUTION FOR THE APPOINTMENT OF A PUBLIC OFFICER AND REGISTERED REPRESENTATIVE TO THE SOUTH AFRICAN REVENUE SERVICE (SARS)</w:t>
       </w:r>
     </w:p>
     <w:p>
@@ -194,19 +194,15 @@
           <w:b/>
           <w:bCs/>
         </w:rPr>
-        <w:t>APPOINTMENT OF REGISTERED REPRESENTATIVE</w:t>
+        <w:t>1. APPOINTMENT OF PUBLIC OFFICER AND REGISTERED REPRESENTATIVE</w:t>
       </w:r>
     </w:p>
     <w:p>
       <w:r>
-        <w:t>The Board hereby appoints Mr. Thapelo</w:t>
+        <w:t>The Board hereby appoints Mr. Bhekisisa (Mdu) Shandu, Executive Director of ASCO NPC, to act as the Public Officer and Registered Representative of ASCO NPC for purposes of the South African Revenue Service (SARS).</w:t>
       </w:r>
-      <w:r>
-        <w:t xml:space="preserve"> Nelson</w:t>
-      </w:r>
-      <w:r>
-        <w:t xml:space="preserve"> Maqalika, Director: Head of ICT and Communications, to act as a Registered Representative of ASCO NPC with the South African Revenue Service (SARS).</w:t>
-      </w:r>
+      <w:r/>
+      <w:r/>
     </w:p>
     <w:p>
       <w:pPr>
@@ -228,52 +224,7 @@
           <w:b/>
           <w:bCs/>
         </w:rPr>
-        <w:t>Mr. Maqalika is authorised to:</w:t>
-      </w:r>
-    </w:p>
-    <w:p>
-      <w:pPr>
-        <w:pStyle w:val="ListBullet"/>
-        <w:spacing w:after="40"/>
-      </w:pPr>
-      <w:r>
-        <w:t>Register and maintain the organisation’s SARS profile;</w:t>
-      </w:r>
-    </w:p>
-    <w:p>
-      <w:pPr>
-        <w:pStyle w:val="ListBullet"/>
-        <w:spacing w:after="40"/>
-      </w:pPr>
-      <w:r>
-        <w:t>Submit and manage all tax-related registrations, returns, and correspondence;</w:t>
-      </w:r>
-    </w:p>
-    <w:p>
-      <w:pPr>
-        <w:pStyle w:val="ListBullet"/>
-        <w:spacing w:after="40"/>
-      </w:pPr>
-      <w:r>
-        <w:t>Receive and respond to communications from SARS;</w:t>
-      </w:r>
-    </w:p>
-    <w:p>
-      <w:pPr>
-        <w:pStyle w:val="ListBullet"/>
-        <w:spacing w:after="40"/>
-      </w:pPr>
-      <w:r>
-        <w:t>Access and update SARS eFiling records; and</w:t>
-      </w:r>
-    </w:p>
-    <w:p>
-      <w:pPr>
-        <w:pStyle w:val="ListBullet"/>
-        <w:spacing w:after="40"/>
-      </w:pPr>
-      <w:r>
-        <w:t>Perform all lawful acts necessary for the administration of ASCO NPC’s tax affairs.</w:t>
+        <w:t>Mr. Bhekisisa (Mdu) Shandu is authorised to represent ASCO NPC in its dealings with SARS and to perform all lawful functions necessary for the administration of the organisation’s tax affairs.</w:t>
       </w:r>
     </w:p>
     <w:p/>
@@ -289,19 +240,15 @@
           <w:b/>
           <w:bCs/>
         </w:rPr>
-        <w:t>AUTHORITY OF THE EXECUTIVE DIRECTOR</w:t>
+        <w:t>2. AUTHORITY OF THE REGISTERED REPRESENTATIVE</w:t>
       </w:r>
     </w:p>
     <w:p>
       <w:r>
-        <w:t>The Board further resolves that Mr. Bhekisisa Shandu, Executive Director, shall possess the same level of authority and access to the South African Revenue Service (SARS) as Mr. Thapelo</w:t>
+        <w:t>Mr. Bhekisisa (Mdu) Shandu is specifically authorised to register and maintain the ASCO NPC SARS taxpayer profile; manage applicable tax references on SARS eFiling; submit registrations, returns, declarations, applications and supporting documentation; receive and respond to SARS correspondence; communicate with SARS officials; submit applications relating to tax affairs, PBO status and Section 18A approval where applicable; provide information requested by SARS; manage verification and compliance matters; and perform all other lawful acts reasonably necessary for ASCO NPC’s tax affairs.</w:t>
       </w:r>
-      <w:r>
-        <w:t xml:space="preserve"> Nelson</w:t>
-      </w:r>
-      <w:r>
-        <w:t xml:space="preserve"> Maqalika.</w:t>
-      </w:r>
+      <w:r/>
+      <w:r/>
     </w:p>
     <w:p>
       <w:pPr>
@@ -323,52 +270,9 @@
           <w:b/>
           <w:bCs/>
         </w:rPr>
-        <w:t>Mr. Bhekisisa Shandu is authorised to:</w:t>
-      </w:r>
-    </w:p>
-    <w:p>
-      <w:pPr>
-        <w:pStyle w:val="ListBullet"/>
-        <w:spacing w:after="40"/>
-      </w:pPr>
-      <w:r>
-        <w:t>Access the SARS eFiling profile of ASCO NPC;</w:t>
-      </w:r>
-    </w:p>
-    <w:p>
-      <w:pPr>
-        <w:pStyle w:val="ListBullet"/>
-        <w:spacing w:after="40"/>
-      </w:pPr>
-      <w:r>
-        <w:t>Act as a Registered Representative where permitted by SARS;</w:t>
-      </w:r>
-    </w:p>
-    <w:p>
-      <w:pPr>
-        <w:pStyle w:val="ListBullet"/>
-        <w:spacing w:after="40"/>
-      </w:pPr>
-      <w:r>
-        <w:t>Submit documentation and correspondence;</w:t>
-      </w:r>
-    </w:p>
-    <w:p>
-      <w:pPr>
-        <w:pStyle w:val="ListBullet"/>
-        <w:spacing w:after="40"/>
-      </w:pPr>
-      <w:r>
-        <w:t>Communicate directly with SARS officials; and</w:t>
-      </w:r>
-    </w:p>
-    <w:p>
-      <w:pPr>
-        <w:pStyle w:val="ListBullet"/>
-        <w:spacing w:after="40"/>
-      </w:pPr>
-      <w:r>
-        <w:t>Perform all functions necessary for the effective administration of the organisation’s tax affairs.</w:t>
+        <w:t>3. INTERNAL BOARD AUTHORITY</w:t>
+        <w:br/>
+        <w:t>The Board confirms that Mr. Bhekisisa (Mdu) Shandu is duly authorised by the Board to act for ASCO NPC within the scope of this resolution. This authority is granted in his capacity as Executive Director and, for SARS purposes, as the Public Officer and Registered Representative of ASCO NPC.</w:t>
       </w:r>
     </w:p>
     <w:p/>
@@ -487,6 +391,7 @@
         <w:trPr>
           <w:cantSplit/>
           <w:jc w:val="center"/>
+          <w:cantSplit/>
         </w:trPr>
         <w:tc>
           <w:tcPr>
@@ -776,6 +681,7 @@
         <w:trPr>
           <w:cantSplit/>
           <w:jc w:val="center"/>
+          <w:cantSplit/>
         </w:trPr>
         <w:tc>
           <w:tcPr>

</xml_diff>